<commit_message>
fix(docs): regenerate Word acceptance handbook
</commit_message>
<xml_diff>
--- a/docs/submission/WeKnora_课题三_功能展示与验收手册_李青松.docx
+++ b/docs/submission/WeKnora_课题三_功能展示与验收手册_李青松.docx
@@ -269,15 +269,48 @@
     </w:p>
     <w:p>
       <w:r>
-        <w:t>建议按“版本确认 → 页面演示 → CLI 复现 → 缓存数据 → 自动化测试”的顺序验收。Word 中可在目录区域右键更新域，生成带页码目录。</w:t>
+        <w:t>建议按“版本确认 → 页面演示 → CLI 复现 → 缓存数据 → 自动化测试”的顺序验收。</w:t>
       </w:r>
     </w:p>
     <w:p>
-      <w:fldChar w:fldCharType="begin"/>
-      <w:instrText xml:space="preserve">TOC \o "1-3" \h \z \u</w:instrText>
-      <w:fldChar w:fldCharType="separate"/>
-      <w:t>在 Word 中右键此处并选择“更新域”以生成目录。</w:t>
-      <w:fldChar w:fldCharType="end"/>
+      <w:pPr>
+        <w:pStyle w:val="ListBullet"/>
+      </w:pPr>
+      <w:r>
+        <w:t>一、验收结论与版本启动</w:t>
+      </w:r>
+    </w:p>
+    <w:p>
+      <w:pPr>
+        <w:pStyle w:val="ListBullet"/>
+      </w:pPr>
+      <w:r>
+        <w:t>二、九项功能逐项展示与验收</w:t>
+      </w:r>
+    </w:p>
+    <w:p>
+      <w:pPr>
+        <w:pStyle w:val="ListBullet"/>
+      </w:pPr>
+      <w:r>
+        <w:t>三、Embedding 与 Wiki 缓存实测对照</w:t>
+      </w:r>
+    </w:p>
+    <w:p>
+      <w:pPr>
+        <w:pStyle w:val="ListBullet"/>
+      </w:pPr>
+      <w:r>
+        <w:t>四、完整自动化验证与已知问题</w:t>
+      </w:r>
+    </w:p>
+    <w:p>
+      <w:pPr>
+        <w:pStyle w:val="ListBullet"/>
+      </w:pPr>
+      <w:r>
+        <w:t>五、证据索引与验收记录表</w:t>
+      </w:r>
     </w:p>
     <w:p>
       <w:r>
@@ -6062,15 +6095,7 @@
         <w:color w:val="646E78"/>
         <w:sz w:val="16"/>
       </w:rPr>
-      <w:t xml:space="preserve">第 </w:t>
-    </w:r>
-    <w:fldSimple w:instr="PAGE"/>
-    <w:r>
-      <w:rPr>
-        <w:color w:val="646E78"/>
-        <w:sz w:val="16"/>
-      </w:rPr>
-      <w:t xml:space="preserve"> 页</w:t>
+      <w:t>WeKnora 课题三 · 功能展示与验收手册</w:t>
     </w:r>
   </w:p>
 </w:ftr>

</xml_diff>

<commit_message>
docs: correct wiki cache baseline comparison
</commit_message>
<xml_diff>
--- a/docs/submission/WeKnora_课题三_功能展示与验收手册_李青松.docx
+++ b/docs/submission/WeKnora_课题三_功能展示与验收手册_李青松.docx
@@ -806,7 +806,7 @@
               <w:rPr>
                 <w:sz w:val="18"/>
               </w:rPr>
-              <w:t>热运行整体 +8.51 pp；引用抽取 +5.51 pp</w:t>
+              <w:t>初始基线至最终热运行：页面生成 +10.20 pp；整体 +10.96 pp</w:t>
             </w:r>
           </w:p>
         </w:tc>
@@ -3165,12 +3165,12 @@
         <w:pStyle w:val="Heading2"/>
       </w:pPr>
       <w:r>
-        <w:t>9 月 8 日与最终版本实测对比</w:t>
+        <w:t>最初无专项优化版本与最终版本实测对比</w:t>
       </w:r>
     </w:p>
     <w:p>
       <w:r>
-        <w:t xml:space="preserve">使用同一知识库、同一文档和同一模型连续运行。统一口径为 </w:t>
+        <w:t xml:space="preserve">主基线取 9 月 3 日保存的 4 次“项目尚未实施 Wiki Prompt 专项优化”运行中位数，再与最终版本使用同一知识库、同一文档和同一模型的真实运行对比。统一口径为 </w:t>
       </w:r>
       <w:r>
         <w:rPr>
@@ -3181,6 +3181,531 @@
       </w:r>
       <w:r>
         <w:t>。</w:t>
+      </w:r>
+    </w:p>
+    <w:tbl>
+      <w:tblPr>
+        <w:tblStyle w:val="TableGrid"/>
+        <w:tblW w:type="auto" w:w="0"/>
+        <w:jc w:val="center"/>
+        <w:tblLook w:firstColumn="1" w:firstRow="1" w:lastColumn="0" w:lastRow="0" w:noHBand="0" w:noVBand="1" w:val="04A0"/>
+      </w:tblPr>
+      <w:tblGrid>
+        <w:gridCol w:w="1587"/>
+        <w:gridCol w:w="1587"/>
+        <w:gridCol w:w="1587"/>
+        <w:gridCol w:w="1587"/>
+        <w:gridCol w:w="1587"/>
+        <w:gridCol w:w="1587"/>
+      </w:tblGrid>
+      <w:tr>
+        <w:trPr>
+          <w:tblHeader w:val="true"/>
+        </w:trPr>
+        <w:tc>
+          <w:tcPr>
+            <w:tcW w:type="dxa" w:w="1587"/>
+            <w:vAlign w:val="center"/>
+            <w:shd w:fill="1F4E78"/>
+          </w:tcPr>
+          <w:p>
+            <w:pPr>
+              <w:spacing w:after="20" w:before="20"/>
+            </w:pPr>
+            <w:r>
+              <w:rPr>
+                <w:b/>
+                <w:color w:val="FFFFFF"/>
+                <w:sz w:val="16"/>
+              </w:rPr>
+              <w:t>范围</w:t>
+            </w:r>
+          </w:p>
+        </w:tc>
+        <w:tc>
+          <w:tcPr>
+            <w:tcW w:type="dxa" w:w="1587"/>
+            <w:vAlign w:val="center"/>
+            <w:shd w:fill="1F4E78"/>
+          </w:tcPr>
+          <w:p>
+            <w:pPr>
+              <w:spacing w:after="20" w:before="20"/>
+            </w:pPr>
+            <w:r>
+              <w:rPr>
+                <w:b/>
+                <w:color w:val="FFFFFF"/>
+                <w:sz w:val="16"/>
+              </w:rPr>
+              <w:t>初始基线中位数</w:t>
+            </w:r>
+          </w:p>
+        </w:tc>
+        <w:tc>
+          <w:tcPr>
+            <w:tcW w:type="dxa" w:w="1587"/>
+            <w:vAlign w:val="center"/>
+            <w:shd w:fill="1F4E78"/>
+          </w:tcPr>
+          <w:p>
+            <w:pPr>
+              <w:spacing w:after="20" w:before="20"/>
+            </w:pPr>
+            <w:r>
+              <w:rPr>
+                <w:b/>
+                <w:color w:val="FFFFFF"/>
+                <w:sz w:val="16"/>
+              </w:rPr>
+              <w:t>最终冷运行</w:t>
+            </w:r>
+          </w:p>
+        </w:tc>
+        <w:tc>
+          <w:tcPr>
+            <w:tcW w:type="dxa" w:w="1587"/>
+            <w:vAlign w:val="center"/>
+            <w:shd w:fill="1F4E78"/>
+          </w:tcPr>
+          <w:p>
+            <w:pPr>
+              <w:spacing w:after="20" w:before="20"/>
+            </w:pPr>
+            <w:r>
+              <w:rPr>
+                <w:b/>
+                <w:color w:val="FFFFFF"/>
+                <w:sz w:val="16"/>
+              </w:rPr>
+              <w:t>冷运行总提升</w:t>
+            </w:r>
+          </w:p>
+        </w:tc>
+        <w:tc>
+          <w:tcPr>
+            <w:tcW w:type="dxa" w:w="1587"/>
+            <w:vAlign w:val="center"/>
+            <w:shd w:fill="1F4E78"/>
+          </w:tcPr>
+          <w:p>
+            <w:pPr>
+              <w:spacing w:after="20" w:before="20"/>
+            </w:pPr>
+            <w:r>
+              <w:rPr>
+                <w:b/>
+                <w:color w:val="FFFFFF"/>
+                <w:sz w:val="16"/>
+              </w:rPr>
+              <w:t>最终热运行</w:t>
+            </w:r>
+          </w:p>
+        </w:tc>
+        <w:tc>
+          <w:tcPr>
+            <w:tcW w:type="dxa" w:w="1587"/>
+            <w:vAlign w:val="center"/>
+            <w:shd w:fill="1F4E78"/>
+          </w:tcPr>
+          <w:p>
+            <w:pPr>
+              <w:spacing w:after="20" w:before="20"/>
+            </w:pPr>
+            <w:r>
+              <w:rPr>
+                <w:b/>
+                <w:color w:val="FFFFFF"/>
+                <w:sz w:val="16"/>
+              </w:rPr>
+              <w:t>热运行总提升</w:t>
+            </w:r>
+          </w:p>
+        </w:tc>
+      </w:tr>
+      <w:tr>
+        <w:tc>
+          <w:tcPr>
+            <w:tcW w:type="dxa" w:w="1587"/>
+            <w:vAlign w:val="center"/>
+          </w:tcPr>
+          <w:p>
+            <w:pPr>
+              <w:spacing w:after="20" w:before="20"/>
+            </w:pPr>
+            <w:r>
+              <w:rPr>
+                <w:sz w:val="16"/>
+              </w:rPr>
+              <w:t>全部 Wiki 调用</w:t>
+            </w:r>
+          </w:p>
+        </w:tc>
+        <w:tc>
+          <w:tcPr>
+            <w:tcW w:type="dxa" w:w="1587"/>
+            <w:vAlign w:val="center"/>
+          </w:tcPr>
+          <w:p>
+            <w:pPr>
+              <w:spacing w:after="20" w:before="20"/>
+            </w:pPr>
+            <w:r>
+              <w:rPr>
+                <w:sz w:val="16"/>
+              </w:rPr>
+              <w:t>14.01%</w:t>
+            </w:r>
+          </w:p>
+        </w:tc>
+        <w:tc>
+          <w:tcPr>
+            <w:tcW w:type="dxa" w:w="1587"/>
+            <w:vAlign w:val="center"/>
+          </w:tcPr>
+          <w:p>
+            <w:pPr>
+              <w:spacing w:after="20" w:before="20"/>
+            </w:pPr>
+            <w:r>
+              <w:rPr>
+                <w:sz w:val="16"/>
+              </w:rPr>
+              <w:t>17.19%</w:t>
+            </w:r>
+          </w:p>
+        </w:tc>
+        <w:tc>
+          <w:tcPr>
+            <w:tcW w:type="dxa" w:w="1587"/>
+            <w:vAlign w:val="center"/>
+          </w:tcPr>
+          <w:p>
+            <w:pPr>
+              <w:spacing w:after="20" w:before="20"/>
+            </w:pPr>
+            <w:r>
+              <w:rPr>
+                <w:sz w:val="16"/>
+              </w:rPr>
+              <w:t>+3.18 pp</w:t>
+            </w:r>
+          </w:p>
+        </w:tc>
+        <w:tc>
+          <w:tcPr>
+            <w:tcW w:type="dxa" w:w="1587"/>
+            <w:vAlign w:val="center"/>
+          </w:tcPr>
+          <w:p>
+            <w:pPr>
+              <w:spacing w:after="20" w:before="20"/>
+            </w:pPr>
+            <w:r>
+              <w:rPr>
+                <w:sz w:val="16"/>
+              </w:rPr>
+              <w:t>24.97%</w:t>
+            </w:r>
+          </w:p>
+        </w:tc>
+        <w:tc>
+          <w:tcPr>
+            <w:tcW w:type="dxa" w:w="1587"/>
+            <w:vAlign w:val="center"/>
+          </w:tcPr>
+          <w:p>
+            <w:pPr>
+              <w:spacing w:after="20" w:before="20"/>
+            </w:pPr>
+            <w:r>
+              <w:rPr>
+                <w:sz w:val="16"/>
+              </w:rPr>
+              <w:t>+10.96 pp</w:t>
+            </w:r>
+          </w:p>
+        </w:tc>
+      </w:tr>
+      <w:tr>
+        <w:tc>
+          <w:tcPr>
+            <w:tcW w:type="dxa" w:w="1587"/>
+            <w:vAlign w:val="center"/>
+            <w:shd w:fill="F3F6F9"/>
+          </w:tcPr>
+          <w:p>
+            <w:pPr>
+              <w:spacing w:after="20" w:before="20"/>
+            </w:pPr>
+            <w:r>
+              <w:rPr>
+                <w:sz w:val="16"/>
+              </w:rPr>
+              <w:t>页面生成</w:t>
+            </w:r>
+          </w:p>
+        </w:tc>
+        <w:tc>
+          <w:tcPr>
+            <w:tcW w:type="dxa" w:w="1587"/>
+            <w:vAlign w:val="center"/>
+            <w:shd w:fill="F3F6F9"/>
+          </w:tcPr>
+          <w:p>
+            <w:pPr>
+              <w:spacing w:after="20" w:before="20"/>
+            </w:pPr>
+            <w:r>
+              <w:rPr>
+                <w:sz w:val="16"/>
+              </w:rPr>
+              <w:t>11.29%</w:t>
+            </w:r>
+          </w:p>
+        </w:tc>
+        <w:tc>
+          <w:tcPr>
+            <w:tcW w:type="dxa" w:w="1587"/>
+            <w:vAlign w:val="center"/>
+            <w:shd w:fill="F3F6F9"/>
+          </w:tcPr>
+          <w:p>
+            <w:pPr>
+              <w:spacing w:after="20" w:before="20"/>
+            </w:pPr>
+            <w:r>
+              <w:rPr>
+                <w:sz w:val="16"/>
+              </w:rPr>
+              <w:t>19.99%</w:t>
+            </w:r>
+          </w:p>
+        </w:tc>
+        <w:tc>
+          <w:tcPr>
+            <w:tcW w:type="dxa" w:w="1587"/>
+            <w:vAlign w:val="center"/>
+            <w:shd w:fill="F3F6F9"/>
+          </w:tcPr>
+          <w:p>
+            <w:pPr>
+              <w:spacing w:after="20" w:before="20"/>
+            </w:pPr>
+            <w:r>
+              <w:rPr>
+                <w:sz w:val="16"/>
+              </w:rPr>
+              <w:t>+8.70 pp</w:t>
+            </w:r>
+          </w:p>
+        </w:tc>
+        <w:tc>
+          <w:tcPr>
+            <w:tcW w:type="dxa" w:w="1587"/>
+            <w:vAlign w:val="center"/>
+            <w:shd w:fill="F3F6F9"/>
+          </w:tcPr>
+          <w:p>
+            <w:pPr>
+              <w:spacing w:after="20" w:before="20"/>
+            </w:pPr>
+            <w:r>
+              <w:rPr>
+                <w:sz w:val="16"/>
+              </w:rPr>
+              <w:t>21.49%</w:t>
+            </w:r>
+          </w:p>
+        </w:tc>
+        <w:tc>
+          <w:tcPr>
+            <w:tcW w:type="dxa" w:w="1587"/>
+            <w:vAlign w:val="center"/>
+            <w:shd w:fill="F3F6F9"/>
+          </w:tcPr>
+          <w:p>
+            <w:pPr>
+              <w:spacing w:after="20" w:before="20"/>
+            </w:pPr>
+            <w:r>
+              <w:rPr>
+                <w:sz w:val="16"/>
+              </w:rPr>
+              <w:t>+10.20 pp</w:t>
+            </w:r>
+          </w:p>
+        </w:tc>
+      </w:tr>
+      <w:tr>
+        <w:tc>
+          <w:tcPr>
+            <w:tcW w:type="dxa" w:w="1587"/>
+            <w:vAlign w:val="center"/>
+          </w:tcPr>
+          <w:p>
+            <w:pPr>
+              <w:spacing w:after="20" w:before="20"/>
+            </w:pPr>
+            <w:r>
+              <w:rPr>
+                <w:sz w:val="16"/>
+              </w:rPr>
+              <w:t>引用抽取</w:t>
+            </w:r>
+          </w:p>
+        </w:tc>
+        <w:tc>
+          <w:tcPr>
+            <w:tcW w:type="dxa" w:w="1587"/>
+            <w:vAlign w:val="center"/>
+          </w:tcPr>
+          <w:p>
+            <w:pPr>
+              <w:spacing w:after="20" w:before="20"/>
+            </w:pPr>
+            <w:r>
+              <w:rPr>
+                <w:sz w:val="16"/>
+              </w:rPr>
+              <w:t>10.44%</w:t>
+            </w:r>
+          </w:p>
+        </w:tc>
+        <w:tc>
+          <w:tcPr>
+            <w:tcW w:type="dxa" w:w="1587"/>
+            <w:vAlign w:val="center"/>
+          </w:tcPr>
+          <w:p>
+            <w:pPr>
+              <w:spacing w:after="20" w:before="20"/>
+            </w:pPr>
+            <w:r>
+              <w:rPr>
+                <w:sz w:val="16"/>
+              </w:rPr>
+              <w:t>14.86%</w:t>
+            </w:r>
+          </w:p>
+        </w:tc>
+        <w:tc>
+          <w:tcPr>
+            <w:tcW w:type="dxa" w:w="1587"/>
+            <w:vAlign w:val="center"/>
+          </w:tcPr>
+          <w:p>
+            <w:pPr>
+              <w:spacing w:after="20" w:before="20"/>
+            </w:pPr>
+            <w:r>
+              <w:rPr>
+                <w:sz w:val="16"/>
+              </w:rPr>
+              <w:t>+4.42 pp</w:t>
+            </w:r>
+          </w:p>
+        </w:tc>
+        <w:tc>
+          <w:tcPr>
+            <w:tcW w:type="dxa" w:w="1587"/>
+            <w:vAlign w:val="center"/>
+          </w:tcPr>
+          <w:p>
+            <w:pPr>
+              <w:spacing w:after="20" w:before="20"/>
+            </w:pPr>
+            <w:r>
+              <w:rPr>
+                <w:sz w:val="16"/>
+              </w:rPr>
+              <w:t>15.34%</w:t>
+            </w:r>
+          </w:p>
+        </w:tc>
+        <w:tc>
+          <w:tcPr>
+            <w:tcW w:type="dxa" w:w="1587"/>
+            <w:vAlign w:val="center"/>
+          </w:tcPr>
+          <w:p>
+            <w:pPr>
+              <w:spacing w:after="20" w:before="20"/>
+            </w:pPr>
+            <w:r>
+              <w:rPr>
+                <w:sz w:val="16"/>
+              </w:rPr>
+              <w:t>+4.90 pp</w:t>
+            </w:r>
+          </w:p>
+        </w:tc>
+      </w:tr>
+    </w:tbl>
+    <w:p>
+      <w:pPr>
+        <w:spacing w:after="20"/>
+      </w:pPr>
+    </w:p>
+    <w:p>
+      <w:pPr>
+        <w:pStyle w:val="Heading2"/>
+      </w:pPr>
+      <w:r>
+        <w:t>结果解释</w:t>
+      </w:r>
+    </w:p>
+    <w:p>
+      <w:pPr>
+        <w:pStyle w:val="ListBullet"/>
+      </w:pPr>
+      <w:r>
+        <w:t>初始基线没有项目级 Wiki Prompt Cache 优化，但模型服务商已有隐式缓存，所以读取率不为零。</w:t>
+      </w:r>
+    </w:p>
+    <w:p>
+      <w:pPr>
+        <w:pStyle w:val="ListBullet"/>
+      </w:pPr>
+      <w:r>
+        <w:t>页面生成从最初基线 11.29% 提升至最终热运行 21.49%，增加 10.20 个百分点，是完整开发周期的主要直接收益。</w:t>
+      </w:r>
+    </w:p>
+    <w:p>
+      <w:pPr>
+        <w:pStyle w:val="ListBullet"/>
+      </w:pPr>
+      <w:r>
+        <w:t>引用抽取把稳定候选集合与动态 chunks 分离，从 10.44% 提升至 15.34%，增加 4.90 个百分点。</w:t>
+      </w:r>
+    </w:p>
+    <w:p>
+      <w:pPr>
+        <w:pStyle w:val="ListBullet"/>
+      </w:pPr>
+      <w:r>
+        <w:t>全部 Wiki 调用提高 10.96 个百分点，其中包含候选抽取在五分钟窗口内取得的高隐式命中；分阶段判断显式断点效果时，应同时查看页面生成和引用抽取两行。</w:t>
+      </w:r>
+    </w:p>
+    <w:p>
+      <w:pPr>
+        <w:pStyle w:val="ListBullet"/>
+      </w:pPr>
+      <w:r>
+        <w:t>每轮 28 次调用全部成功，其中页面生成 16 次、引用抽取 9 次。</w:t>
+      </w:r>
+    </w:p>
+    <w:p>
+      <w:pPr>
+        <w:pStyle w:val="Heading2"/>
+      </w:pPr>
+      <w:r>
+        <w:t>第二阶段增量：9 月 8 日至最终版本</w:t>
+      </w:r>
+    </w:p>
+    <w:p>
+      <w:r>
+        <w:t>9 月 8 日已经包含第一阶段缓存优化，因此只用于说明 9 月 10 日新增稳定前缀断点带来的后续增量，不作为最终成果的起始基线。</w:t>
       </w:r>
     </w:p>
     <w:tbl>
@@ -3279,7 +3804,7 @@
                 <w:color w:val="FFFFFF"/>
                 <w:sz w:val="16"/>
               </w:rPr>
-              <w:t>冷提升</w:t>
+              <w:t>第二阶段冷增量</w:t>
             </w:r>
           </w:p>
         </w:tc>
@@ -3339,7 +3864,7 @@
                 <w:color w:val="FFFFFF"/>
                 <w:sz w:val="16"/>
               </w:rPr>
-              <w:t>热提升</w:t>
+              <w:t>第二阶段热增量</w:t>
             </w:r>
           </w:p>
         </w:tc>
@@ -3719,46 +4244,6 @@
       <w:pPr>
         <w:spacing w:after="20"/>
       </w:pPr>
-    </w:p>
-    <w:p>
-      <w:pPr>
-        <w:pStyle w:val="Heading2"/>
-      </w:pPr>
-      <w:r>
-        <w:t>结果解释</w:t>
-      </w:r>
-    </w:p>
-    <w:p>
-      <w:pPr>
-        <w:pStyle w:val="ListBullet"/>
-      </w:pPr>
-      <w:r>
-        <w:t>页面生成原有隐式复用已经较高，新方案继续提升，但增量较小。</w:t>
-      </w:r>
-    </w:p>
-    <w:p>
-      <w:pPr>
-        <w:pStyle w:val="ListBullet"/>
-      </w:pPr>
-      <w:r>
-        <w:t>引用抽取把稳定候选集合与动态 chunks 分离，收益明显，是最能直接证明本轮设计有效的阶段。</w:t>
-      </w:r>
-    </w:p>
-    <w:p>
-      <w:pPr>
-        <w:pStyle w:val="ListBullet"/>
-      </w:pPr>
-      <w:r>
-        <w:t>整体热运行 +8.51 pp 还包含候选抽取在五分钟窗口内取得的高隐式命中，不能全部归因于显式断点。汇报直接收益应优先使用页面生成和引用抽取两行。</w:t>
-      </w:r>
-    </w:p>
-    <w:p>
-      <w:pPr>
-        <w:pStyle w:val="ListBullet"/>
-      </w:pPr>
-      <w:r>
-        <w:t>每轮 28 次调用全部成功，其中页面生成 16 次、引用抽取 9 次。</w:t>
-      </w:r>
     </w:p>
     <w:p>
       <w:pPr>

</xml_diff>

<commit_message>
docs: sync submission version with final tag
</commit_message>
<xml_diff>
--- a/docs/submission/WeKnora_课题三_功能展示与验收手册_李青松.docx
+++ b/docs/submission/WeKnora_课题三_功能展示与验收手册_李青松.docx
@@ -192,7 +192,7 @@
               <w:spacing w:after="40" w:before="40"/>
             </w:pPr>
             <w:r>
-              <w:t>501f957e584f99f1d231466fa27fa0c0ccd25980</w:t>
+              <w:t>098ab7c68fd6318c1572d3bc944c3dac0ae70d3f</w:t>
             </w:r>
           </w:p>
         </w:tc>
@@ -940,7 +940,7 @@
           <w:rFonts w:ascii="Consolas" w:hAnsi="Consolas" w:eastAsia="Consolas"/>
           <w:color w:val="C04000"/>
         </w:rPr>
-        <w:t>501f957e584f99f1d231466fa27fa0c0ccd25980</w:t>
+        <w:t>098ab7c68fd6318c1572d3bc944c3dac0ae70d3f</w:t>
       </w:r>
       <w:r>
         <w:t xml:space="preserve">，Tag 为 </w:t>

</xml_diff>